<commit_message>
Add mission controller, cable release, and tune PID by model sweep
- Tools/SwarmControl/mission.py: takeoff, transfer, lowering, release, return, landing over NetMQ;
  stage completion checks the real payload position; optional tension equalizer
- Tools/SwarmControl/mock_unity.py: kinematic stand-in for Unity to dry-run the mission logic
- RSMACable: release via CableRelease_<id> topic
- Gyrocopt prefab PID 5/1/1.5 -> 10/2/12 (wind 10+-3 m/s position error 0.53 -> 0.20 m on the model);
  tension unevenness trade-off documented
- Docs and edited analysis docx updated with the new numbers

Co-Authored-By: Claude Sonnet 5.5 <noreply@anthropic.com>
Claude-Session: https://claude.ai/code/session_01R8vagdWw87wqd3WpEnzWW8
</commit_message>
<xml_diff>
--- a/docs/Аналитика инженерного решения (правки).docx
+++ b/docs/Аналитика инженерного решения (правки).docx
@@ -4411,7 +4411,7 @@
           <w:sz w:val="24"/>
           <w:szCs w:val="24"/>
         </w:rPr>
-        <w:t xml:space="preserve">без ветра — 0,04 / 0,05 м;</w:t>
+        <w:t xml:space="preserve">без ветра — 0,03 / 0,04 м;</w:t>
       </w:r>
     </w:p>
     <w:p>
@@ -4432,7 +4432,7 @@
           <w:sz w:val="24"/>
           <w:szCs w:val="24"/>
         </w:rPr>
-        <w:t xml:space="preserve">ветер 8 м/с с порывами ±2 м/с — 0,30 / 0,54 м;</w:t>
+        <w:t xml:space="preserve">ветер 8 м/с с порывами ±2 м/с — 0,12 / 0,21 м;</w:t>
       </w:r>
     </w:p>
     <w:p>
@@ -4453,7 +4453,7 @@
           <w:sz w:val="24"/>
           <w:szCs w:val="24"/>
         </w:rPr>
-        <w:t xml:space="preserve">ветер 10 м/с с порывами ±3 м/с — 0,52 / 0,94 м; при усиленном регуляторе положения — 0,37 / 0,66 м;</w:t>
+        <w:t xml:space="preserve">ветер 10 м/с с порывами ±3 м/с — 0,20 / 0,39 м;</w:t>
       </w:r>
     </w:p>
     <w:p>
@@ -4474,7 +4474,7 @@
           <w:sz w:val="24"/>
           <w:szCs w:val="24"/>
         </w:rPr>
-        <w:t xml:space="preserve">после отказа одного из 6 БПЛА — смещение груза около 0,9 м.</w:t>
+        <w:t xml:space="preserve">после отказа одного из 6 БПЛА — смещение груза около 1 м.</w:t>
       </w:r>
     </w:p>
     <w:p>
@@ -4491,7 +4491,7 @@
           <w:sz w:val="24"/>
           <w:szCs w:val="24"/>
         </w:rPr>
-        <w:t xml:space="preserve">Постоянный ветер на точность почти не влияет (0,07 м при 10 м/с), основной вклад дают порывы. Результаты моделирования подлежат подтверждению в симуляторе Unity измерением положения груза относительно точки выгрузки.</w:t>
+        <w:t xml:space="preserve">Постоянный ветер на точность почти не влияет (0,07 м при 10 м/с), основной вклад дают порывы; коэффициенты регулятора положения подобраны перебором на модели (ошибка в ветре 10 ± 3 м/с снизилась с 0,53 до 0,20 м). Результаты моделирования подлежат подтверждению в симуляторе Unity измерением положения груза относительно точки выгрузки.</w:t>
       </w:r>
     </w:p>
     <w:p>

</xml_diff>

<commit_message>
Reduce payload swing: acceleration limit and ZVD input shaper in the mission controller
Model analysis: swing is mostly quasi-static (acceleration lean a/g and wind lean), the oscillating
part is small. Acceleration 0.5 -> 0.3 m/s2 with a ZVD shaper (payload period 5.5 s) cuts the peak
swing 5.55 -> 3.71 deg (no wind) and 7.96 -> 5.73 deg (wind 10+-3 m/s) for +8 s on a 70 m route.

- mission.py: Setpoint with ZVD shaper, --max-swing, --shaper-period, --no-shaper, fast mode after
  cable release, lowering never below the start height
- swarm_model.py: shaper, signed payload offset in the log, new defaults
- requirements_check.py: peak swing in motion, tension unevenness in motion / hovering
- Quadrocopter.maxAcceleration default 0.3
- Docs and analysis docx updated

Co-Authored-By: Claude Sonnet 5.5 <noreply@anthropic.com>
Claude-Session: https://claude.ai/code/session_01R8vagdWw87wqd3WpEnzWW8
</commit_message>
<xml_diff>
--- a/docs/Аналитика инженерного решения (правки).docx
+++ b/docs/Аналитика инженерного решения (правки).docx
@@ -4411,7 +4411,7 @@
           <w:sz w:val="24"/>
           <w:szCs w:val="24"/>
         </w:rPr>
-        <w:t xml:space="preserve">без ветра — 0,03 / 0,04 м;</w:t>
+        <w:t xml:space="preserve">без ветра — 0,04 / 0,08 м;</w:t>
       </w:r>
     </w:p>
     <w:p>
@@ -4432,7 +4432,7 @@
           <w:sz w:val="24"/>
           <w:szCs w:val="24"/>
         </w:rPr>
-        <w:t xml:space="preserve">ветер 8 м/с с порывами ±2 м/с — 0,12 / 0,21 м;</w:t>
+        <w:t xml:space="preserve">ветер 8 м/с с порывами ±2 м/с — 0,12 / 0,22 м;</w:t>
       </w:r>
     </w:p>
     <w:p>
@@ -4453,7 +4453,7 @@
           <w:sz w:val="24"/>
           <w:szCs w:val="24"/>
         </w:rPr>
-        <w:t xml:space="preserve">ветер 10 м/с с порывами ±3 м/с — 0,20 / 0,39 м;</w:t>
+        <w:t xml:space="preserve">ветер 10 м/с с порывами ±3 м/с — 0,21 / 0,39 м;</w:t>
       </w:r>
     </w:p>
     <w:p>

</xml_diff>